<commit_message>
court(moctapped): opening brief docx generated and gated, amicus and opening re-rendered on the model; LaTeX loses a note bound after § (fb-595.54.75)
Co-Authored-By: Claude Opus 5.5 <noreply@anthropic.com>
</commit_message>
<xml_diff>
--- a/courts/eighth-circuit/missouri/state/court-of-appeals-eastern-district/amicus-brief/usage/OUTPUT-amicus-brief.docx
+++ b/courts/eighth-circuit/missouri/state/court-of-appeals-eastern-district/amicus-brief/usage/OUTPUT-amicus-brief.docx
@@ -2221,7 +2221,7 @@
         <w:tab/>
       </w:r>
       <w:r>
-        <w:t xml:space="preserve">11, 15</w:t>
+        <w:t xml:space="preserve">10, 15</w:t>
       </w:r>
     </w:p>
     <w:p>
@@ -4152,7 +4152,7 @@
         <w:tab/>
       </w:r>
       <w:r>
-        <w:t xml:space="preserve">14</w:t>
+        <w:t xml:space="preserve">13</w:t>
       </w:r>
     </w:p>
     <w:p>
@@ -4962,7 +4962,7 @@
         <w:tab/>
       </w:r>
       <w:r>
-        <w:t xml:space="preserve">11</w:t>
+        <w:t xml:space="preserve">12</w:t>
       </w:r>
     </w:p>
     <w:p>
@@ -6036,7 +6036,7 @@
         <w:tab/>
       </w:r>
       <w:r>
-        <w:t xml:space="preserve">8</w:t>
+        <w:t xml:space="preserve">9</w:t>
       </w:r>
     </w:p>
     <w:p>
@@ -6819,7 +6819,7 @@
         <w:tab/>
       </w:r>
       <w:r>
-        <w:t xml:space="preserve">10</w:t>
+        <w:t xml:space="preserve">11</w:t>
       </w:r>
     </w:p>
     <w:p>
@@ -7081,7 +7081,7 @@
         <w:tab/>
       </w:r>
       <w:r>
-        <w:t xml:space="preserve">10</w:t>
+        <w:t xml:space="preserve">11</w:t>
       </w:r>
     </w:p>
     <w:p>
@@ -8048,7 +8048,7 @@
         <w:tab/>
       </w:r>
       <w:r>
-        <w:t xml:space="preserve">10, 11</w:t>
+        <w:t xml:space="preserve">10, 12</w:t>
       </w:r>
     </w:p>
     <w:p>
@@ -8387,9 +8387,9 @@
         <w:t xml:space="preserve"> </w:t>
       </w:r>
       <w:r>
-        <w:t xml:space="preserve">http://www.cdc.gov/​art/​pdf/2012-report/​art</w:t>
+        <w:t xml:space="preserve">http://​www.​cdc.​gov/​art/​pdf/​2012-​report/​art</w:t>
         <w:noBreakHyphen/>
-        <w:t xml:space="preserve">2012-fertility-clinic-report.pdf</w:t>
+        <w:t xml:space="preserve">2012-​fertility-​clinic-​report.​pdf</w:t>
       </w:r>
       <w:r>
         <w:t xml:space="preserve">   </w:t>
@@ -8501,7 +8501,7 @@
         <w:t xml:space="preserve"> </w:t>
       </w:r>
       <w:r>
-        <w:t xml:space="preserve">http://www.hhs.gov/​opa/​about-opa-and</w:t>
+        <w:t xml:space="preserve">http://​www.​hhs.​gov/​opa/​about-​opa-​and</w:t>
       </w:r>
       <w:r>
         <w:t xml:space="preserve"> </w:t>
@@ -8737,7 +8737,7 @@
         <w:t xml:space="preserve"> </w:t>
       </w:r>
       <w:r>
-        <w:t xml:space="preserve">https://www.nlm.nih.gov/​medlineplus/​ency/​article/002398.htm</w:t>
+        <w:t xml:space="preserve">https://​www.​nlm.​nih.​gov/​medlineplus/​ency/​article/​002398.​htm</w:t>
       </w:r>
       <w:r>
         <w:t xml:space="preserve">   </w:t>
@@ -8955,7 +8955,7 @@
         <w:t xml:space="preserve"> </w:t>
       </w:r>
       <w:r>
-        <w:t xml:space="preserve">http://nyulangone.org/​locations/​fertility-center/​in-vitro-fertilization</w:t>
+        <w:t xml:space="preserve">http://​nyulangone.​org/​locations/​fertility-​center/​in-​vitro-​fertilization</w:t>
       </w:r>
       <w:r>
         <w:t xml:space="preserve"> </w:t>
@@ -8994,7 +8994,7 @@
         <w:tab/>
       </w:r>
       <w:r>
-        <w:t xml:space="preserve">13</w:t>
+        <w:t xml:space="preserve">14</w:t>
       </w:r>
     </w:p>
     <w:p>
@@ -9293,7 +9293,7 @@
         <w:t xml:space="preserve"> </w:t>
       </w:r>
       <w:r>
-        <w:t xml:space="preserve">http://news.stlpublicradio.org/​post/​university-missouri-gets-swept-renewed-battle-over-embryonic-stem-cell-research</w:t>
+        <w:t xml:space="preserve">http://​news.​stlpublicradio.​org/​post/​university-​missouri-​gets-​swept-​renewed-​battle-​over-​embryonic-​stem-​cell-​research</w:t>
       </w:r>
       <w:r>
         <w:t xml:space="preserve">   </w:t>
@@ -9414,7 +9414,7 @@
         <w:tab/>
       </w:r>
       <w:r>
-        <w:t xml:space="preserve">13</w:t>
+        <w:t xml:space="preserve">14</w:t>
       </w:r>
     </w:p>
     <w:p>
@@ -9475,7 +9475,7 @@
         <w:t xml:space="preserve"> </w:t>
       </w:r>
       <w:r>
-        <w:t xml:space="preserve">http://familybuilding.resolve.org/​fertility-scorecard/</w:t>
+        <w:t xml:space="preserve">http://​familybuilding.​resolve.​org/​fertility-​scorecard/</w:t>
       </w:r>
       <w:r>
         <w:t xml:space="preserve"> </w:t>
@@ -10984,7 +10984,7 @@
         <w:t xml:space="preserve">v. United States</w:t>
       </w:r>
       <w:r>
-        <w:t xml:space="preserve">, 277 U.S. 438, 478 (1928) (Brandeis, J., dissenting) (commenting that the “makers of our Constitution . . . conferred, as against the government, the right to be let alone—the most comprehensive of rights and the right most valued by civilized [people],” which is commonly recognized as a justice’s first explicit recognition of the constitutional right to privacy);</w:t>
+        <w:t xml:space="preserve">, 277 U.S. 438, 478 (1928) (Brandeis, J., dissenting) (commenting that the “makers of our Constitution . . . conferred, as against the government, the right to be let alone—the most comprehensive of rights and the right most valued by civilized [people],” which is commonly recognized as a justice’s first explicit recognition of the constitutional right to privacy);</w:t>
       </w:r>
       <w:r>
         <w:t xml:space="preserve"> </w:t>
@@ -11256,7 +11256,7 @@
         <w:t xml:space="preserve">Nebraska</w:t>
       </w:r>
       <w:r>
-        <w:t xml:space="preserve">, 262 U.S. 390 (1923) (holding that constitutional liberty interests include “not merely freedom from bodily restraint but also the right of the individual . . . to marry, establish a home and bring up children”);</w:t>
+        <w:t xml:space="preserve">, 262 U.S. 390 (1923) (holding that constitutional liberty interests include “not merely freedom from bodily restraint but also the right of the individual . . . to marry, establish a home and bring up children”);</w:t>
       </w:r>
       <w:r>
         <w:t xml:space="preserve"> </w:t>
@@ -13105,7 +13105,7 @@
         <w:t xml:space="preserve"> </w:t>
       </w:r>
       <w:r>
-        <w:t xml:space="preserve">https://www.nlm.nih.gov/​medlineplus/​ency/​article/002398.htm (last visited March 11, 2016) (stating that “[t]he combined sperm and egg is called a zygote,” that after a few days (usually five), it divides sufficiently to “form a ball of cells called a blastocyst,” and that “[w]eek 5 [measured from the first day of the gestational parent’s last menstrual cycle] is the beginning of the embryonic period”). IVF-created fertilized ova are always frozen or implanted as zygotes, blastocysts, or so-called “early cleaved embryos,” not as embryos. Amicus does not know precisely when the fertilized ova at issue were cryopreserved,</w:t>
+        <w:t xml:space="preserve">https://​www.​nlm.​nih.​gov/​medlineplus/​ency/​article/​002398.​htm (last visited March 11, 2016) (stating that “[t]he combined sperm and egg is called a zygote,” that after a few days (usually five), it divides sufficiently to “form a ball of cells called a blastocyst,” and that “[w]eek 5 [measured from the first day of the gestational parent’s last menstrual cycle] is the beginning of the embryonic period”). IVF-created fertilized ova are always frozen or implanted as zygotes, blastocysts, or so-called “early cleaved embryos,” not as embryos. Amicus does not know precisely when the fertilized ova at issue were cryopreserved,</w:t>
       </w:r>
       <w:r>
         <w:t xml:space="preserve"> </w:t>
@@ -13411,37 +13411,13 @@
         <w:t xml:space="preserve"> </w:t>
       </w:r>
       <w:r>
-        <w:t xml:space="preserve">§ 2; Ark. Code §§ 20</w:t>
-      </w:r>
-      <w:r>
-        <w:noBreakHyphen/>
-      </w:r>
-      <w:r>
-        <w:t xml:space="preserve">16</w:t>
-      </w:r>
-      <w:r>
-        <w:noBreakHyphen/>
-      </w:r>
-      <w:r>
-        <w:t xml:space="preserve">1402(9),</w:t>
-      </w:r>
-      <w:r>
-        <w:t xml:space="preserve"> </w:t>
-      </w:r>
-      <w:r>
-        <w:t xml:space="preserve">20</w:t>
-      </w:r>
-      <w:r>
-        <w:noBreakHyphen/>
-      </w:r>
-      <w:r>
-        <w:t xml:space="preserve">16</w:t>
-      </w:r>
-      <w:r>
-        <w:noBreakHyphen/>
-      </w:r>
-      <w:r>
-        <w:t xml:space="preserve">1702(5,</w:t>
+        <w:t xml:space="preserve">§ 2; Ark. Code §§ 20-⁠⁠16-⁠⁠1402(9),</w:t>
+      </w:r>
+      <w:r>
+        <w:t xml:space="preserve"> </w:t>
+      </w:r>
+      <w:r>
+        <w:t xml:space="preserve">20-⁠16-⁠1702(5,</w:t>
       </w:r>
       <w:r>
         <w:t xml:space="preserve"> </w:t>
@@ -13459,7 +13435,7 @@
         <w:t xml:space="preserve"> </w:t>
       </w:r>
       <w:r>
-        <w:t xml:space="preserve">510/2;</w:t>
+        <w:t xml:space="preserve">510/⁠2;</w:t>
       </w:r>
       <w:r>
         <w:t xml:space="preserve"> </w:t>
@@ -13550,7 +13526,7 @@
         <w:t xml:space="preserve"> </w:t>
       </w:r>
       <w:r>
-        <w:t xml:space="preserve">at 301 (stating that “it is simply beyond dispute that public records are freely accessible to ensure confidence in the impartiality and fairness of the judicial system . . . .”). Since the trial court did not address Section 1.205, it is unclear to the ACLU amicus whether arguments concerning the applicability of Section 1.205 have been waived.</w:t>
+        <w:t xml:space="preserve">at 301 (stating that “it is simply beyond dispute that public records are freely accessible to ensure confidence in the impartiality and fairness of the judicial system . . . .”). Since the trial court did not address Section 1.205, it is unclear to the ACLU amicus whether arguments concerning the applicability of Section 1.205 have been waived.</w:t>
       </w:r>
       <w:r>
         <w:t xml:space="preserve"> </w:t>
@@ -13821,7 +13797,7 @@
         <w:t xml:space="preserve"> </w:t>
       </w:r>
       <w:r>
-        <w:t xml:space="preserve">OFFICE OF POPULATION AFFAIRS OF THE U.S. DEP’T OF HEALTH &amp; HUMAN SERVS., http://www.hhs.gov/​opa/​about-opa-and-initiatives/​embryo-adoption/ (last visited March 11, 2016). The latest fertility-clinic data from Missouri show there were at least eight fertility clinics providing IVF services in 2013, and all of them cryopreserved fertilized ova.</w:t>
+        <w:t xml:space="preserve">OFFICE OF POPULATION AFFAIRS OF THE U.S. DEP’T OF HEALTH &amp; HUMAN SERVS., http://​www.​hhs.​gov/​opa/​about-​opa-​and-​initiatives/​embryo-​adoption/ (last visited March 11, 2016). The latest fertility-clinic data from Missouri show there were at least eight fertility clinics providing IVF services in 2013, and all of them cryopreserved fertilized ova.</w:t>
       </w:r>
       <w:r>
         <w:t xml:space="preserve"> </w:t>
@@ -13849,13 +13825,13 @@
         <w:noBreakHyphen/>
       </w:r>
       <w:r>
-        <w:t xml:space="preserve">91, NAT’L CNTR. FOR CHRONIC DISEASE PREVENTION &amp; HEALTH PROMOTION (October 2015), http://www.cdc.gov/​art/​pdf/2012-report/​art</w:t>
+        <w:t xml:space="preserve">91, NAT’L CNTR. FOR CHRONIC DISEASE PREVENTION &amp; HEALTH PROMOTION (October 2015), http://​www.​cdc.​gov/​art/​pdf/​2012-​report/​art</w:t>
       </w:r>
       <w:r>
         <w:noBreakHyphen/>
       </w:r>
       <w:r>
-        <w:t xml:space="preserve">2012-fertility-clinic-report.pdf. Likewise, so-called “embryonic” stem-cell research, which results in the creation and destruction of human blastocysts, is currently conducted in Missouri.</w:t>
+        <w:t xml:space="preserve">2012-​fertility-​clinic-​report.​pdf. Likewise, so-called “embryonic” stem-cell research, which results in the creation and destruction of human blastocysts, is currently conducted in Missouri.</w:t>
       </w:r>
       <w:r>
         <w:t xml:space="preserve"> </w:t>
@@ -13893,7 +13869,7 @@
         <w:t xml:space="preserve"> </w:t>
       </w:r>
       <w:r>
-        <w:t xml:space="preserve">St. Louis Public Radio (Oct. 22, 2015), “University of Missouri gets swept into renewed battle over embryonic stem-cell research,” http://news.stlpublicradio.org/​post/​university-missouri-gets-swept-renewed-battle-over-embryonic-stem-cell-research.</w:t>
+        <w:t xml:space="preserve">St. Louis Public Radio (Oct. 22, 2015), “University of Missouri gets swept into renewed battle over embryonic stem-cell research,” http://​news.​stlpublicradio.​org/​post/​university-​missouri-​gets-​swept-​renewed-​battle-​over-​embryonic-​stem-​cell-​research.</w:t>
       </w:r>
     </w:p>
   </w:footnote>
@@ -13950,7 +13926,7 @@
         <w:t xml:space="preserve"> </w:t>
       </w:r>
       <w:r>
-        <w:t xml:space="preserve">NYU Langone Med. Ctr., http://nyulangone.org/​locations/​fertility-center/​in-vitro-fertilization (last visited March 16, 2016) (explaining that retrieval and fertilization of several ova per cycle “reduces the need for repeated ovarian stimulation and IVF,” which can be “difficult, both physically and financially”). The average cost of a single cycle of traditional IVF cycle is approximately $12,500, excluding necessary medications, and the average cost per live birth tops $41,000.</w:t>
+        <w:t xml:space="preserve">NYU Langone Med. Ctr., http://​nyulangone.​org/​locations/​fertility-​center/​in-​vitro-​fertilization (last visited March 16, 2016) (explaining that retrieval and fertilization of several ova per cycle “reduces the need for repeated ovarian stimulation and IVF,” which can be “difficult, both physically and financially”). The average cost of a single cycle of traditional IVF cycle is approximately $12,500, excluding necessary medications, and the average cost per live birth tops $41,000.</w:t>
       </w:r>
       <w:r>
         <w:t xml:space="preserve"> </w:t>
@@ -13994,7 +13970,7 @@
         <w:t xml:space="preserve"> </w:t>
       </w:r>
       <w:r>
-        <w:t xml:space="preserve">http://familybuilding.resolve.org/​fertility-scorecard/ (last visited March 16, 2016).</w:t>
+        <w:t xml:space="preserve">http://​familybuilding.​resolve.​org/​fertility-​scorecard/ (last visited March 16, 2016).</w:t>
       </w:r>
     </w:p>
   </w:footnote>
@@ -15043,6 +15019,7 @@
     <w:unhideWhenUsed/>
     <w:qFormat/>
     <w:pPr>
+      <w:keepLines/>
       <w:spacing w:before="0" w:after="140" w:line="299" w:lineRule="exact"/>
     </w:pPr>
     <w:rPr>
@@ -15293,6 +15270,33 @@
     <w:pPr>
       <w:spacing w:before="0" w:after="0" w:line="449" w:lineRule="exact"/>
       <w:ind w:left="2160" w:hanging="720"/>
+    </w:pPr>
+  </w:style>
+  <w:style w:type="paragraph" w:customStyle="1" w:styleId="XdQuoteList1">
+    <w:name w:val="Xd Quote List 1"/>
+    <w:basedOn w:val="Normal"/>
+    <w:qFormat/>
+    <w:pPr>
+      <w:spacing w:before="0" w:after="0" w:line="299" w:lineRule="exact"/>
+      <w:ind w:left="1440" w:right="720" w:hanging="720"/>
+    </w:pPr>
+  </w:style>
+  <w:style w:type="paragraph" w:customStyle="1" w:styleId="XdQuoteList2">
+    <w:name w:val="Xd Quote List 2"/>
+    <w:basedOn w:val="Normal"/>
+    <w:qFormat/>
+    <w:pPr>
+      <w:spacing w:before="0" w:after="0" w:line="299" w:lineRule="exact"/>
+      <w:ind w:left="2160" w:right="720" w:hanging="720"/>
+    </w:pPr>
+  </w:style>
+  <w:style w:type="paragraph" w:customStyle="1" w:styleId="XdQuoteList3">
+    <w:name w:val="Xd Quote List 3"/>
+    <w:basedOn w:val="Normal"/>
+    <w:qFormat/>
+    <w:pPr>
+      <w:spacing w:before="0" w:after="0" w:line="299" w:lineRule="exact"/>
+      <w:ind w:left="2880" w:right="720" w:hanging="720"/>
     </w:pPr>
   </w:style>
   <w:style w:type="paragraph" w:customStyle="1" w:styleId="XdTail">

</xml_diff>